<commit_message>
fixed the garding system for the group projects
</commit_message>
<xml_diff>
--- a/docs/Group project - Description.docx
+++ b/docs/Group project - Description.docx
@@ -5554,7 +5554,7 @@
         <w:rPr>
           <w:rtl w:val="0"/>
         </w:rPr>
-        <w:t xml:space="preserve">After the presentation each student fills out the Peer evaluation form and soon after that they should be able to see their individual grade</w:t>
+        <w:t>After the presentation each student fills out the peer evaluation form, rating themselves and every teammate on contribution and teamwork. The scores are relative: they have to add up to zero or less, so a team cannot be rated above its own average — marking somebody up means marking somebody else down.</w:t>
       </w:r>
     </w:p>
     <w:p>
@@ -5571,7 +5571,7 @@
         <w:rPr>
           <w:rtl w:val="0"/>
         </w:rPr>
-        <w:t xml:space="preserve">The individual grade is calculated based on Jafningjamat and Kennaramat, equally (50/50)</w:t>
+        <w:t>No score a student gives becomes anybody's grade by itself. The teachers read all of it and confirm one contribution figure and one teamwork figure for each student; those confirmed figures adjust the team's project grade into that student's individual grade, by at most +30% and at worst −70%. Written feedback opens for each student as soon as they have handed in their own evaluations, without waiting for the rest of the class; the grades appear when the teachers release them.</w:t>
       </w:r>
     </w:p>
     <w:p>

</xml_diff>